<commit_message>
1.3: autoevaluación de los 12 indicadores de la rúbrica Fase 1
</commit_message>
<xml_diff>
--- a/Fase 1/Evidencias individuales/Ramirez_Karla_1.3_APT122_AutoevaluacionFase1.docx
+++ b/Fase 1/Evidencias individuales/Ramirez_Karla_1.3_APT122_AutoevaluacionFase1.docx
@@ -6209,6 +6209,7 @@
           <w:tcPr>
             <w:tcW w:w="2268" w:type="dxa"/>
             <w:tcMar/>
+            <w:shd w:val="clear" w:color="auto" w:fill="C6E0B4"/>
           </w:tcPr>
           <w:p>
             <w:pPr>
@@ -6482,6 +6483,7 @@
           <w:tcPr>
             <w:tcW w:w="2268" w:type="dxa"/>
             <w:tcMar/>
+            <w:shd w:val="clear" w:color="auto" w:fill="C6E0B4"/>
           </w:tcPr>
           <w:p>
             <w:pPr>
@@ -6925,6 +6927,7 @@
           <w:tcPr>
             <w:tcW w:w="2268" w:type="dxa"/>
             <w:tcMar/>
+            <w:shd w:val="clear" w:color="auto" w:fill="C6E0B4"/>
           </w:tcPr>
           <w:p>
             <w:pPr>
@@ -7195,6 +7198,7 @@
           <w:tcPr>
             <w:tcW w:w="2268" w:type="dxa"/>
             <w:tcMar/>
+            <w:shd w:val="clear" w:color="auto" w:fill="C6E0B4"/>
           </w:tcPr>
           <w:p>
             <w:pPr>
@@ -7512,6 +7516,7 @@
           <w:tcPr>
             <w:tcW w:w="2268" w:type="dxa"/>
             <w:tcMar/>
+            <w:shd w:val="clear" w:color="auto" w:fill="C6E0B4"/>
           </w:tcPr>
           <w:p>
             <w:pPr>
@@ -7705,6 +7710,7 @@
           <w:tcPr>
             <w:tcW w:w="2268" w:type="dxa"/>
             <w:tcMar/>
+            <w:shd w:val="clear" w:color="auto" w:fill="C6E0B4"/>
           </w:tcPr>
           <w:p>
             <w:pPr>
@@ -7930,6 +7936,7 @@
           <w:tcPr>
             <w:tcW w:w="2268" w:type="dxa"/>
             <w:tcMar/>
+            <w:shd w:val="clear" w:color="auto" w:fill="C6E0B4"/>
           </w:tcPr>
           <w:p>
             <w:pPr>
@@ -8193,6 +8200,7 @@
           <w:tcPr>
             <w:tcW w:w="2268" w:type="dxa"/>
             <w:tcMar/>
+            <w:shd w:val="clear" w:color="auto" w:fill="C6E0B4"/>
           </w:tcPr>
           <w:p>
             <w:pPr>
@@ -8547,6 +8555,7 @@
           <w:tcPr>
             <w:tcW w:w="2126" w:type="dxa"/>
             <w:tcMar/>
+            <w:shd w:val="clear" w:color="auto" w:fill="C6E0B4"/>
           </w:tcPr>
           <w:p>
             <w:pPr>
@@ -8675,6 +8684,7 @@
           <w:tcPr>
             <w:tcW w:w="2268" w:type="dxa"/>
             <w:tcMar/>
+            <w:shd w:val="clear" w:color="auto" w:fill="C6E0B4"/>
           </w:tcPr>
           <w:p>
             <w:pPr>
@@ -8874,6 +8884,7 @@
           <w:tcPr>
             <w:tcW w:w="2126" w:type="dxa"/>
             <w:tcMar/>
+            <w:shd w:val="clear" w:color="auto" w:fill="C6E0B4"/>
           </w:tcPr>
           <w:p>
             <w:pPr>
@@ -9101,6 +9112,7 @@
           <w:tcPr>
             <w:tcW w:w="2268" w:type="dxa"/>
             <w:tcMar/>
+            <w:shd w:val="clear" w:color="auto" w:fill="C6E0B4"/>
           </w:tcPr>
           <w:p>
             <w:pPr>

</xml_diff>